<commit_message>
Add README, markdown versions, fix evidence numbering, normalize filenames
- README.md with author, case study summaries, and method
- Markdown versions of both case studies for in-browser reading
- Fix VE evidence register numbering gap (VE-005 was skipped)
- Rename LLM evaluation docx to consistent underscore naming
</commit_message>
<xml_diff>
--- a/Anakha_Khanmigo_AI_Governance_Portfolio_Case_Study.docx
+++ b/Anakha_Khanmigo_AI_Governance_Portfolio_Case_Study.docx
@@ -2179,7 +2179,7 @@
                 <w:color w:val="23282D"/>
                 <w:sz w:val="15"/>
               </w:rPr>
-              <w:t>VE-006</w:t>
+              <w:t>VE-005</w:t>
             </w:r>
           </w:p>
         </w:tc>
@@ -2313,7 +2313,7 @@
                 <w:color w:val="23282D"/>
                 <w:sz w:val="15"/>
               </w:rPr>
-              <w:t>VE-007</w:t>
+              <w:t>VE-006</w:t>
             </w:r>
           </w:p>
         </w:tc>
@@ -2449,7 +2449,7 @@
                 <w:color w:val="23282D"/>
                 <w:sz w:val="15"/>
               </w:rPr>
-              <w:t>VE-008</w:t>
+              <w:t>VE-007</w:t>
             </w:r>
           </w:p>
         </w:tc>
@@ -2583,7 +2583,7 @@
                 <w:color w:val="23282D"/>
                 <w:sz w:val="15"/>
               </w:rPr>
-              <w:t>VE-009</w:t>
+              <w:t>VE-008</w:t>
             </w:r>
           </w:p>
         </w:tc>

</xml_diff>